<commit_message>
Am actualizat fișierul Cerinte nefunctionale si Impartire iteratii cu noile cerințe
</commit_message>
<xml_diff>
--- a/Cerințe Nefuncționale - lab2.docx
+++ b/Cerințe Nefuncționale - lab2.docx
@@ -766,6 +766,188 @@
         </w:rPr>
         <w:t>.</w:t>
       </w:r>
+    </w:p>
+    <w:p>
+      <w:pPr>
+        <w:numPr>
+          <w:ilvl w:val="0"/>
+          <w:numId w:val="1"/>
+        </w:numPr>
+        <w:autoSpaceDE w:val="0"/>
+        <w:autoSpaceDN w:val="0"/>
+        <w:adjustRightInd w:val="0"/>
+        <w:spacing w:after="0" w:line="240" w:lineRule="auto"/>
+        <w:ind w:left="0" w:firstLine="0"/>
+        <w:rPr>
+          <w:rFonts w:ascii="AppleSystemUIFont" w:hAnsi="AppleSystemUIFont" w:cs="AppleSystemUIFont"/>
+          <w:kern w:val="0"/>
+          <w:sz w:val="26"/>
+          <w:szCs w:val="26"/>
+          <w:lang w:val="en-GB"/>
+        </w:rPr>
+      </w:pPr>
+      <w:proofErr w:type="spellStart"/>
+      <w:r>
+        <w:rPr>
+          <w:rFonts w:ascii="AppleSystemUIFont" w:hAnsi="AppleSystemUIFont" w:cs="AppleSystemUIFont"/>
+          <w:b/>
+          <w:bCs/>
+          <w:kern w:val="0"/>
+          <w:sz w:val="26"/>
+          <w:szCs w:val="26"/>
+          <w:lang w:val="en-GB"/>
+        </w:rPr>
+        <w:t>Securitatea</w:t>
+      </w:r>
+      <w:proofErr w:type="spellEnd"/>
+      <w:r>
+        <w:rPr>
+          <w:rFonts w:ascii="AppleSystemUIFont" w:hAnsi="AppleSystemUIFont" w:cs="AppleSystemUIFont"/>
+          <w:b/>
+          <w:bCs/>
+          <w:kern w:val="0"/>
+          <w:sz w:val="26"/>
+          <w:szCs w:val="26"/>
+          <w:lang w:val="en-GB"/>
+        </w:rPr>
+        <w:t xml:space="preserve"> </w:t>
+      </w:r>
+      <w:proofErr w:type="spellStart"/>
+      <w:r>
+        <w:rPr>
+          <w:rFonts w:ascii="AppleSystemUIFont" w:hAnsi="AppleSystemUIFont" w:cs="AppleSystemUIFont"/>
+          <w:b/>
+          <w:bCs/>
+          <w:kern w:val="0"/>
+          <w:sz w:val="26"/>
+          <w:szCs w:val="26"/>
+          <w:lang w:val="en-GB"/>
+        </w:rPr>
+        <w:t>datelor</w:t>
+      </w:r>
+      <w:proofErr w:type="spellEnd"/>
+      <w:r>
+        <w:rPr>
+          <w:rFonts w:ascii="AppleSystemUIFont" w:hAnsi="AppleSystemUIFont" w:cs="AppleSystemUIFont"/>
+          <w:b/>
+          <w:bCs/>
+          <w:kern w:val="0"/>
+          <w:sz w:val="26"/>
+          <w:szCs w:val="26"/>
+          <w:lang w:val="en-GB"/>
+        </w:rPr>
+        <w:t>:</w:t>
+      </w:r>
+      <w:r>
+        <w:rPr>
+          <w:rFonts w:ascii="AppleSystemUIFont" w:hAnsi="AppleSystemUIFont" w:cs="AppleSystemUIFont"/>
+          <w:kern w:val="0"/>
+          <w:sz w:val="26"/>
+          <w:szCs w:val="26"/>
+          <w:lang w:val="en-GB"/>
+        </w:rPr>
+        <w:t xml:space="preserve"> </w:t>
+      </w:r>
+      <w:proofErr w:type="spellStart"/>
+      <w:r>
+        <w:rPr>
+          <w:rFonts w:ascii="AppleSystemUIFont" w:hAnsi="AppleSystemUIFont" w:cs="AppleSystemUIFont"/>
+          <w:kern w:val="0"/>
+          <w:sz w:val="26"/>
+          <w:szCs w:val="26"/>
+          <w:lang w:val="en-GB"/>
+        </w:rPr>
+        <w:t>Folosirea</w:t>
+      </w:r>
+      <w:proofErr w:type="spellEnd"/>
+      <w:r>
+        <w:rPr>
+          <w:rFonts w:ascii="AppleSystemUIFont" w:hAnsi="AppleSystemUIFont" w:cs="AppleSystemUIFont"/>
+          <w:kern w:val="0"/>
+          <w:sz w:val="26"/>
+          <w:szCs w:val="26"/>
+          <w:lang w:val="en-GB"/>
+        </w:rPr>
+        <w:t xml:space="preserve"> </w:t>
+      </w:r>
+      <w:proofErr w:type="spellStart"/>
+      <w:r>
+        <w:rPr>
+          <w:rFonts w:ascii="AppleSystemUIFont" w:hAnsi="AppleSystemUIFont" w:cs="AppleSystemUIFont"/>
+          <w:kern w:val="0"/>
+          <w:sz w:val="26"/>
+          <w:szCs w:val="26"/>
+          <w:lang w:val="en-GB"/>
+        </w:rPr>
+        <w:t>algoritmilor</w:t>
+      </w:r>
+      <w:proofErr w:type="spellEnd"/>
+      <w:r>
+        <w:rPr>
+          <w:rFonts w:ascii="AppleSystemUIFont" w:hAnsi="AppleSystemUIFont" w:cs="AppleSystemUIFont"/>
+          <w:kern w:val="0"/>
+          <w:sz w:val="26"/>
+          <w:szCs w:val="26"/>
+          <w:lang w:val="en-GB"/>
+        </w:rPr>
+        <w:t xml:space="preserve"> de hash </w:t>
+      </w:r>
+      <w:proofErr w:type="spellStart"/>
+      <w:r>
+        <w:rPr>
+          <w:rFonts w:ascii="AppleSystemUIFont" w:hAnsi="AppleSystemUIFont" w:cs="AppleSystemUIFont"/>
+          <w:kern w:val="0"/>
+          <w:sz w:val="26"/>
+          <w:szCs w:val="26"/>
+          <w:lang w:val="en-GB"/>
+        </w:rPr>
+        <w:t>pentru</w:t>
+      </w:r>
+      <w:proofErr w:type="spellEnd"/>
+      <w:r>
+        <w:rPr>
+          <w:rFonts w:ascii="AppleSystemUIFont" w:hAnsi="AppleSystemUIFont" w:cs="AppleSystemUIFont"/>
+          <w:kern w:val="0"/>
+          <w:sz w:val="26"/>
+          <w:szCs w:val="26"/>
+          <w:lang w:val="en-GB"/>
+        </w:rPr>
+        <w:t xml:space="preserve"> </w:t>
+      </w:r>
+      <w:proofErr w:type="spellStart"/>
+      <w:r>
+        <w:rPr>
+          <w:rFonts w:ascii="AppleSystemUIFont" w:hAnsi="AppleSystemUIFont" w:cs="AppleSystemUIFont"/>
+          <w:kern w:val="0"/>
+          <w:sz w:val="26"/>
+          <w:szCs w:val="26"/>
+          <w:lang w:val="en-GB"/>
+        </w:rPr>
+        <w:t>criptarea</w:t>
+      </w:r>
+      <w:proofErr w:type="spellEnd"/>
+      <w:r>
+        <w:rPr>
+          <w:rFonts w:ascii="AppleSystemUIFont" w:hAnsi="AppleSystemUIFont" w:cs="AppleSystemUIFont"/>
+          <w:kern w:val="0"/>
+          <w:sz w:val="26"/>
+          <w:szCs w:val="26"/>
+          <w:lang w:val="en-GB"/>
+        </w:rPr>
+        <w:t xml:space="preserve"> </w:t>
+      </w:r>
+      <w:proofErr w:type="spellStart"/>
+      <w:r>
+        <w:rPr>
+          <w:rFonts w:ascii="AppleSystemUIFont" w:hAnsi="AppleSystemUIFont" w:cs="AppleSystemUIFont"/>
+          <w:kern w:val="0"/>
+          <w:sz w:val="26"/>
+          <w:szCs w:val="26"/>
+          <w:lang w:val="en-GB"/>
+        </w:rPr>
+        <w:t>datelor</w:t>
+      </w:r>
+      <w:proofErr w:type="spellEnd"/>
     </w:p>
     <w:p/>
     <w:sectPr>

</xml_diff>